<commit_message>
modified:   README.md         modified:   app.py         modified:   docs/presentation.pptx         modified:   docs/project_report.docx         modified:   docs/user_manual.pdf
</commit_message>
<xml_diff>
--- a/docs/project_report.docx
+++ b/docs/project_report.docx
@@ -12,7 +12,7 @@
           <w:color w:val="0D1B2A"/>
           <w:sz w:val="56"/>
         </w:rPr>
-        <w:t>SkyGuard AI — Project Report</w:t>
+        <w:t>Agentic UAV Mission Planning and Safety Compliance Assistant — Project Report</w:t>
       </w:r>
     </w:p>
     <w:p>
@@ -58,7 +58,7 @@
           <w:color w:val="2D3748"/>
           <w:sz w:val="22"/>
         </w:rPr>
-        <w:t>SkyGuard AI is an end-to-end software application for planning Unmanned Aerial Vehicle (UAV) missions using an agentic AI-based workflow. The system accepts a mission request in natural language or via a structured form, converts it into a flight plan, generates optimal waypoints, performs safety compliance checks, applies corrections when violations are detected, and produces detailed reports and exportable flight files.</w:t>
+        <w:t>Agentic UAV Mission Planning and Safety Compliance Assistant is an end-to-end software application for planning Unmanned Aerial Vehicle (UAV) missions using an agentic AI-based workflow. The system accepts a mission request in natural language or via a structured form, converts it into a flight plan, generates optimal waypoints, performs safety compliance checks, applies corrections when violations are detected, and produces detailed reports and exportable flight files.</w:t>
       </w:r>
     </w:p>
     <w:p>
@@ -1333,7 +1333,7 @@
           <w:color w:val="2D3748"/>
           <w:sz w:val="22"/>
         </w:rPr>
-        <w:t>SkyGuard AI successfully demonstrates an end-to-end agentic UAV mission planning pipeline that is physically accurate, legally compliant, and ready for real-world integration.</w:t>
+        <w:t>Agentic UAV Mission Planning and Safety Compliance Assistant successfully demonstrates an end-to-end agentic UAV mission planning pipeline that is physically accurate, legally compliant, and ready for real-world integration.</w:t>
       </w:r>
     </w:p>
     <w:p>

</xml_diff>